<commit_message>
docs(vision): el grafo de habitabilidad — por que NO competimos con Google Maps
Sobre la contribucion del corredor: el grafo propio NO es de POIs (cancha de
Google, escala imbatible -> P5 pierde), es de HABITABILIDAD (la capa que
Google no captura porque no esta en el negocio de la decision inmobiliaria).
Contribuyentes: corredores/residentes con conocimiento tacito y piel en el
juego (P7). Portable via OKF. Secuencia de 4 escalones (1 hecho: curacion
por inmueble; 2 proximo: geo-localizar + propagacion a zona = el grafo real).

Co-Authored-By: Claude Opus 4.8 (1M context) <noreply@anthropic.com>
</commit_message>
<xml_diff>
--- a/docs/VISION_Sistema_Vivo.docx
+++ b/docs/VISION_Sistema_Vivo.docx
@@ -580,6 +580,278 @@
         <w:pStyle w:val="Heading1"/>
       </w:pPr>
       <w:r>
+        <w:t>El grafo de habitabilidad — por qué NO competimos con Google Maps</w:t>
+      </w:r>
+    </w:p>
+    <w:p>
+      <w:r>
+        <w:t xml:space="preserve">La contribución del corredor debe ser </w:t>
+      </w:r>
+      <w:r>
+        <w:rPr>
+          <w:b/>
+        </w:rPr>
+        <w:t>tan frictionless y rica como la de Google Maps</w:t>
+      </w:r>
+      <w:r>
+        <w:t xml:space="preserve"> — pero construyendo un </w:t>
+      </w:r>
+      <w:r>
+        <w:rPr>
+          <w:b/>
+        </w:rPr>
+        <w:t>grafo PROPIO</w:t>
+      </w:r>
+      <w:r>
+        <w:t>. Cuidado con la trampa de "igual o superior a Google":</w:t>
+      </w:r>
+    </w:p>
+    <w:p>
+      <w:r>
+        <w:rPr>
+          <w:b/>
+        </w:rPr>
+        <w:t>La trampa:</w:t>
+      </w:r>
+      <w:r>
+        <w:t xml:space="preserve"> Google tiene miles de millones de contribuyentes (Local Guides). Su foso es </w:t>
+      </w:r>
+      <w:r>
+        <w:rPr>
+          <w:b/>
+        </w:rPr>
+        <w:t>escala + ubicuidad</w:t>
+      </w:r>
+      <w:r>
+        <w:t xml:space="preserve"> en POIs genéricos (nombre, categoría, horarios, fotos). </w:t>
+      </w:r>
+      <w:r>
+        <w:rPr>
+          <w:b/>
+        </w:rPr>
+        <w:t>Si compites ahí — "más POIs que Google" — pierdes</w:t>
+      </w:r>
+      <w:r>
+        <w:t xml:space="preserve"> (P5). Nunca tendrás sus contribuyentes.</w:t>
+      </w:r>
+    </w:p>
+    <w:p>
+      <w:r>
+        <w:rPr>
+          <w:b/>
+        </w:rPr>
+        <w:t>Dónde SÍ eres superior:</w:t>
+      </w:r>
+      <w:r>
+        <w:t xml:space="preserve"> Google sabe *"PROMART está aquí, abre 9-6"*. Google NO sabe *"calle residencial tranquila, buena para familias; la escuela de 2 cuadras cerró; el Metro la vuelve ideal para quien trabaja en el norte; el ruido real a las 7pm es medio"*. Esa es la </w:t>
+      </w:r>
+      <w:r>
+        <w:rPr>
+          <w:b/>
+        </w:rPr>
+        <w:t>capa de habitabilidad</w:t>
+      </w:r>
+      <w:r>
+        <w:t xml:space="preserve"> — el grafo que vale, porque Google </w:t>
+      </w:r>
+      <w:r>
+        <w:rPr>
+          <w:b/>
+        </w:rPr>
+        <w:t>no está en el negocio de la decisión inmobiliaria</w:t>
+      </w:r>
+      <w:r>
+        <w:t>, tú sí.</w:t>
+      </w:r>
+    </w:p>
+    <w:p>
+      <w:pPr>
+        <w:pStyle w:val="IntenseQuote"/>
+      </w:pPr>
+      <w:r>
+        <w:rPr>
+          <w:b/>
+        </w:rPr>
+        <w:t>"Superior a Google" ≠ más cantidad. = una dimensión más profunda que Google no captura, con contribuyentes que Google no tiene (corredores + residentes con conocimiento tácito y piel en el juego — P7).</w:t>
+      </w:r>
+    </w:p>
+    <w:p>
+      <w:r>
+        <w:rPr>
+          <w:b/>
+        </w:rPr>
+        <w:t>Qué es el grafo:</w:t>
+      </w:r>
+    </w:p>
+    <w:p>
+      <w:pPr>
+        <w:pStyle w:val="ListBullet"/>
+      </w:pPr>
+      <w:r>
+        <w:rPr>
+          <w:b/>
+        </w:rPr>
+        <w:t>Nodos:</w:t>
+      </w:r>
+      <w:r>
+        <w:t xml:space="preserve"> lugares y zonas (coordenadas) + atributos de habitabilidad.</w:t>
+      </w:r>
+    </w:p>
+    <w:p>
+      <w:pPr>
+        <w:pStyle w:val="ListBullet"/>
+      </w:pPr>
+      <w:r>
+        <w:rPr>
+          <w:b/>
+        </w:rPr>
+        <w:t>Aristas:</w:t>
+      </w:r>
+      <w:r>
+        <w:t xml:space="preserve"> proximidad, "pertenece a zona X", "a N min a pie de".</w:t>
+      </w:r>
+    </w:p>
+    <w:p>
+      <w:pPr>
+        <w:pStyle w:val="ListBullet"/>
+      </w:pPr>
+      <w:r>
+        <w:rPr>
+          <w:b/>
+        </w:rPr>
+        <w:t>Atributos:</w:t>
+      </w:r>
+      <w:r>
+        <w:t xml:space="preserve"> lo verificable (caminabilidad, ruido) + lo tácito-curado (cerró/abrió, carácter de zona, perfil ideal).</w:t>
+      </w:r>
+    </w:p>
+    <w:p>
+      <w:pPr>
+        <w:pStyle w:val="ListBullet"/>
+      </w:pPr>
+      <w:r>
+        <w:rPr>
+          <w:b/>
+        </w:rPr>
+        <w:t>Portable:</w:t>
+      </w:r>
+      <w:r>
+        <w:t xml:space="preserve"> es </w:t>
+      </w:r>
+      <w:r>
+        <w:rPr>
+          <w:b/>
+        </w:rPr>
+        <w:t>literalmente OKF</w:t>
+      </w:r>
+      <w:r>
+        <w:t xml:space="preserve"> — un grafo de conocimiento en archivos portables. El día que lo exportes, cualquier agente consume "la verdad de los lugares de Quito" desde ti. Foso + interoperabilidad en una pieza.</w:t>
+      </w:r>
+    </w:p>
+    <w:p>
+      <w:r>
+        <w:rPr>
+          <w:b/>
+        </w:rPr>
+        <w:t>La secuencia (roadmap del grafo — disciplina, no "boil the ocean"):</w:t>
+      </w:r>
+    </w:p>
+    <w:p>
+      <w:pPr>
+        <w:pStyle w:val="ListNumber"/>
+      </w:pPr>
+      <w:r>
+        <w:t xml:space="preserve">✅ </w:t>
+      </w:r>
+      <w:r>
+        <w:rPr>
+          <w:b/>
+        </w:rPr>
+        <w:t>Curación por inmueble</w:t>
+      </w:r>
+      <w:r>
+        <w:t xml:space="preserve"> (cerrar/agregar POIs) — el átomo del grafo. *(Hecho — jun 2026.)*</w:t>
+      </w:r>
+    </w:p>
+    <w:p>
+      <w:pPr>
+        <w:pStyle w:val="ListNumber"/>
+      </w:pPr>
+      <w:r>
+        <w:t xml:space="preserve">🔜 </w:t>
+      </w:r>
+      <w:r>
+        <w:rPr>
+          <w:b/>
+        </w:rPr>
+        <w:t>Geo-localizar la contribución + propagación a zona</w:t>
+      </w:r>
+      <w:r>
+        <w:t xml:space="preserve"> — que un POI confirmado cerca del depto A enriquezca a todos los inmuebles del sector. </w:t>
+      </w:r>
+      <w:r>
+        <w:rPr>
+          <w:b/>
+        </w:rPr>
+        <w:t>Este escalón es el que "conecta con el mapa"</w:t>
+      </w:r>
+      <w:r>
+        <w:t xml:space="preserve"> y empieza a construir el grafo de verdad.</w:t>
+      </w:r>
+    </w:p>
+    <w:p>
+      <w:pPr>
+        <w:pStyle w:val="ListNumber"/>
+      </w:pPr>
+      <w:r>
+        <w:t xml:space="preserve">🔜 </w:t>
+      </w:r>
+      <w:r>
+        <w:rPr>
+          <w:b/>
+        </w:rPr>
+        <w:t>Atributos de habitabilidad estructurados</w:t>
+      </w:r>
+      <w:r>
+        <w:t xml:space="preserve"> — tags curados (carácter de zona, ruido percibido, perfil ideal), NO texto libre (que miente).</w:t>
+      </w:r>
+    </w:p>
+    <w:p>
+      <w:pPr>
+        <w:pStyle w:val="ListNumber"/>
+      </w:pPr>
+      <w:r>
+        <w:t xml:space="preserve">🔜 </w:t>
+      </w:r>
+      <w:r>
+        <w:rPr>
+          <w:b/>
+        </w:rPr>
+        <w:t>El grafo portable (OKF)</w:t>
+      </w:r>
+      <w:r>
+        <w:t xml:space="preserve"> — el activo canónico exportable a terceros (B2B2C).</w:t>
+      </w:r>
+    </w:p>
+    <w:p>
+      <w:r>
+        <w:t xml:space="preserve">Cada escalón </w:t>
+      </w:r>
+      <w:r>
+        <w:rPr>
+          <w:b/>
+        </w:rPr>
+        <w:t>gana</w:t>
+      </w:r>
+      <w:r>
+        <w:t xml:space="preserve"> el siguiente. El escalón 2 es el próximo incremento natural.</w:t>
+      </w:r>
+    </w:p>
+    <w:p>
+      <w:pPr>
+        <w:pStyle w:val="Heading1"/>
+      </w:pPr>
+      <w:r>
         <w:t>La disciplina (lo que NO hacer)</w:t>
       </w:r>
     </w:p>
@@ -622,6 +894,29 @@
       </w:r>
       <w:r>
         <w:t>.</w:t>
+      </w:r>
+    </w:p>
+    <w:p>
+      <w:r>
+        <w:t xml:space="preserve">Y dentro del grafo: </w:t>
+      </w:r>
+      <w:r>
+        <w:rPr>
+          <w:b/>
+        </w:rPr>
+        <w:t>no reconstruir Google Maps.</w:t>
+      </w:r>
+      <w:r>
+        <w:t xml:space="preserve"> No es un grafo de POIs (su cancha), es un grafo de </w:t>
+      </w:r>
+      <w:r>
+        <w:rPr>
+          <w:b/>
+        </w:rPr>
+        <w:t>habitabilidad</w:t>
+      </w:r>
+      <w:r>
+        <w:t xml:space="preserve"> (la tuya).</w:t>
       </w:r>
     </w:p>
     <w:p>

</xml_diff>

<commit_message>
docs(vision): de ranking a recomendacion — la verdad del lugar como sustrato del intent-matching
La tesis economica mas profunda (analogia Airbnb): cuando la IA es el
intermediario, se compite por RECOMENDACION (intent-matching), no por ranking.
Los portales (Realtor/Esri/Zillow) juegan ranking sobre listings; Contexto
construye el sustrato de la recomendacion = la verdad del lugar. Nueva razon
economica del loop del corredor: dato rico y verdadero -> mas recomendado ->
mas leads (incentivo de mercado para hidratar). No competimos por estar arriba
en una lista; competimos por ser la verdad que la IA recomienda.

Co-Authored-By: Claude Opus 4.8 (1M context) <noreply@anthropic.com>
</commit_message>
<xml_diff>
--- a/docs/VISION_Sistema_Vivo.docx
+++ b/docs/VISION_Sistema_Vivo.docx
@@ -852,6 +852,216 @@
         <w:pStyle w:val="Heading1"/>
       </w:pPr>
       <w:r>
+        <w:t>De RANKING a RECOMENDACIÓN — por qué la verdad del lugar es el sustrato del intent-matching</w:t>
+      </w:r>
+    </w:p>
+    <w:p>
+      <w:r>
+        <w:t>*(La tesis económica más profunda. NO es UX — es estructural. Surgió de la analogía de Airbnb: cuando la IA se vuelve el intermediario, se compite por recomendaciones, no por rankings.)*</w:t>
+      </w:r>
+    </w:p>
+    <w:p>
+      <w:r>
+        <w:rPr>
+          <w:b/>
+        </w:rPr>
+        <w:t>El cambio:</w:t>
+      </w:r>
+      <w:r>
+        <w:t xml:space="preserve"> hoy todos compiten en </w:t>
+      </w:r>
+      <w:r>
+        <w:rPr>
+          <w:b/>
+        </w:rPr>
+        <w:t>ranking</w:t>
+      </w:r>
+      <w:r>
+        <w:t xml:space="preserve"> (SEO, posición en el portal, OTA rankings). Cuando la IA es el intermediario entre la persona y el inventario, eso muere: la IA </w:t>
+      </w:r>
+      <w:r>
+        <w:rPr>
+          <w:b/>
+        </w:rPr>
+        <w:t>no rankea — empareja intención con resultado.</w:t>
+      </w:r>
+      <w:r>
+        <w:t xml:space="preserve"> *"La IA no está buscando tu inventario; quiere que la intención coincida con un resultado."*</w:t>
+      </w:r>
+    </w:p>
+    <w:p>
+      <w:r>
+        <w:rPr>
+          <w:b/>
+        </w:rPr>
+        <w:t>La pregunta que importa deja de ser</w:t>
+      </w:r>
+      <w:r>
+        <w:t xml:space="preserve"> "¿cómo subo en la lista?" </w:t>
+      </w:r>
+      <w:r>
+        <w:rPr>
+          <w:b/>
+        </w:rPr>
+        <w:t>y pasa a ser</w:t>
+      </w:r>
+      <w:r>
+        <w:t xml:space="preserve"> "¿qué tan bien la VERDAD de mi lugar coincide con la intención de la persona, y cuánto del recorrido resuelve?"</w:t>
+      </w:r>
+    </w:p>
+    <w:p>
+      <w:r>
+        <w:rPr>
+          <w:b/>
+        </w:rPr>
+        <w:t>Por qué reposiciona a los competidores:</w:t>
+      </w:r>
+      <w:r>
+        <w:t xml:space="preserve"> Realtor.com / Esri / Zillow siguen jugando el juego del </w:t>
+      </w:r>
+      <w:r>
+        <w:rPr>
+          <w:b/>
+        </w:rPr>
+        <w:t>ranking</w:t>
+      </w:r>
+      <w:r>
+        <w:t xml:space="preserve"> (búsqueda más inteligente sobre listings). </w:t>
+      </w:r>
+      <w:r>
+        <w:rPr>
+          <w:b/>
+        </w:rPr>
+        <w:t>Contexto construye la infraestructura de la RECOMENDACIÓN.</w:t>
+      </w:r>
+      <w:r>
+        <w:t xml:space="preserve"> Para emparejar *"familia que quiere tranquilidad + caminable + cerca de un buen colegio + parque"*, la IA necesita </w:t>
+      </w:r>
+      <w:r>
+        <w:rPr>
+          <w:b/>
+        </w:rPr>
+        <w:t>saber la verdad del lugar</w:t>
+      </w:r>
+      <w:r>
+        <w:t xml:space="preserve"> — justo lo que los portales NO tienen (ellos tienen listings + specs + comportamiento; nosotros, la verdad del lugar).</w:t>
+      </w:r>
+    </w:p>
+    <w:p>
+      <w:pPr>
+        <w:pStyle w:val="IntenseQuote"/>
+      </w:pPr>
+      <w:r>
+        <w:rPr>
+          <w:b/>
+        </w:rPr>
+        <w:t>Nuestra data no es "más data" — es el SUSTRATO del intent-matching.</w:t>
+      </w:r>
+      <w:r>
+        <w:t xml:space="preserve"> Sin saber cómo ES vivir ahí, nadie puede recomendar que encaja con una vida. Eso es lo que el Catastro Vivo construye.</w:t>
+      </w:r>
+    </w:p>
+    <w:p>
+      <w:r>
+        <w:rPr>
+          <w:b/>
+        </w:rPr>
+        <w:t>La razón económica NUEVA del loop del corredor:</w:t>
+      </w:r>
+      <w:r>
+        <w:t xml:space="preserve"> en el mundo del ranking el corredor paga por posición / pelea SEO. En el mundo de la recomendación, </w:t>
+      </w:r>
+      <w:r>
+        <w:rPr>
+          <w:b/>
+        </w:rPr>
+        <w:t>el corredor cuyo lugar tiene el dato más rico y verdadero es el que la IA RECOMIENDA mejor → más leads.</w:t>
+      </w:r>
+      <w:r>
+        <w:t xml:space="preserve"> Hidratar deja de ser "insignia de verificado" y pasa a ser </w:t>
+      </w:r>
+      <w:r>
+        <w:rPr>
+          <w:b/>
+        </w:rPr>
+        <w:t>"ser encontrable por intención."</w:t>
+      </w:r>
+      <w:r>
+        <w:t xml:space="preserve"> El dato fresco = más recomendaciones = más cierres → </w:t>
+      </w:r>
+      <w:r>
+        <w:rPr>
+          <w:b/>
+        </w:rPr>
+        <w:t>incentivo directo de mercado para alimentar el grafo.</w:t>
+      </w:r>
+    </w:p>
+    <w:p>
+      <w:r>
+        <w:rPr>
+          <w:b/>
+        </w:rPr>
+        <w:t>El recorrido completo (analogía Airbnb):</w:t>
+      </w:r>
+      <w:r>
+        <w:t xml:space="preserve"> Airbnb → alojamiento + bienestar + experiencias + transfers; *"más necesidades bajo un mismo techo = ventaja"*. Para "dónde vivir": descubrir zona → habitabilidad → ver la unidad → confiar en el dato → conectar con el corredor → decidir. </w:t>
+      </w:r>
+      <w:r>
+        <w:rPr>
+          <w:b/>
+        </w:rPr>
+        <w:t>Contexto ya abarca más de ese recorrido que un portal</w:t>
+      </w:r>
+      <w:r>
+        <w:t xml:space="preserve"> (que solo lista + refiere).</w:t>
+      </w:r>
+    </w:p>
+    <w:p>
+      <w:pPr>
+        <w:pStyle w:val="IntenseQuote"/>
+      </w:pPr>
+      <w:r>
+        <w:rPr>
+          <w:b/>
+        </w:rPr>
+        <w:t>Síntesis:</w:t>
+      </w:r>
+      <w:r>
+        <w:t xml:space="preserve"> los portales construyeron la infraestructura del </w:t>
+      </w:r>
+      <w:r>
+        <w:rPr>
+          <w:b/>
+        </w:rPr>
+        <w:t>ranking</w:t>
+      </w:r>
+      <w:r>
+        <w:t xml:space="preserve"> (listings, SEO, comportamiento). Contexto construye la del </w:t>
+      </w:r>
+      <w:r>
+        <w:rPr>
+          <w:b/>
+        </w:rPr>
+        <w:t>emparejamiento de intención</w:t>
+      </w:r>
+      <w:r>
+        <w:t xml:space="preserve">: la verdad de los lugares. En la era de la recomendación, </w:t>
+      </w:r>
+      <w:r>
+        <w:rPr>
+          <w:b/>
+        </w:rPr>
+        <w:t>quien la IA confía para saber "cómo es realmente vivir ahí" gana la recomendación</w:t>
+      </w:r>
+      <w:r>
+        <w:t xml:space="preserve"> — y eso requiere dato local, verificado y contribuido que los gigantes no tienen. *No compites por estar arriba en una lista; compites por ser la verdad que la IA recomienda.*</w:t>
+      </w:r>
+    </w:p>
+    <w:p>
+      <w:pPr>
+        <w:pStyle w:val="Heading1"/>
+      </w:pPr>
+      <w:r>
         <w:t>La disciplina (lo que NO hacer)</w:t>
       </w:r>
     </w:p>

</xml_diff>